<commit_message>
docs: resolver pendientes del DAS con respuestas del equipo + investigacion de competencia
- Matriz de partes interesadas: roster confirmado, afectacion/preocupacion
  redactadas.
- Utility Tree / ASR: el equipo decide no priorizar un atributo de calidad
  sobre otro (los 5 quedan en Alta); se agrega la matriz ASR con el gap de
  seguridad marcado explicitamente.
- Metodologia (Design Thinking, Scrum/Kanban): documentado honestamente que
  todo el proceso lo hizo el equipo internamente, sin usuarios externos ni
  tablero formal -- en vez de simular un proceso que no ocurrio.
- Justificacion de innovacion: investigacion real de soluciones existentes
  (SafeMap/EAN, BICI-SAFE/Distrital, compromiso Secretaria de Seguridad via
  OGP, SpotCrime, Citizen) con fuentes citadas.

Co-Authored-By: Claude Sonnet 5 <noreply@anthropic.com>
</commit_message>
<xml_diff>
--- a/docs/Documento_Arquitectura_Software.docx
+++ b/docs/Documento_Arquitectura_Software.docx
@@ -146,7 +146,7 @@
           <w:sz w:val="20"/>
           <w:szCs w:val="20"/>
         </w:rPr>
-        <w:t xml:space="preserve">Fila inicial con lo evidente del proyecto. Afectación/preocupación quedan en blanco para que el equipo las complete — no es algo que se pueda derivar del código.</w:t>
+        <w:t xml:space="preserve">Roster confirmado completo por el equipo (2026-10-19). Afectación/preocupación redactadas a partir del rol de cada parte en el proyecto -- quedan como primer borrador para que el equipo ajuste matices si hace falta.</w:t>
       </w:r>
     </w:p>
     <w:tbl>
@@ -162,10 +162,10 @@
         </w:tblBorders>
       </w:tblPr>
       <w:tblGrid>
-        <w:gridCol w:w="2621"/>
-        <w:gridCol w:w="2016"/>
-        <w:gridCol w:w="2722"/>
-        <w:gridCol w:w="2722"/>
+        <w:gridCol w:w="2419"/>
+        <w:gridCol w:w="1814"/>
+        <w:gridCol w:w="2822"/>
+        <w:gridCol w:w="3024"/>
       </w:tblGrid>
       <w:tr>
         <w:trPr>
@@ -173,7 +173,7 @@
         </w:trPr>
         <w:tc>
           <w:tcPr>
-            <w:tcW w:type="dxa" w:w="2621"/>
+            <w:tcW w:type="dxa" w:w="2419"/>
             <w:shd w:fill="1F3864" w:val="clear"/>
             <w:tcMar>
               <w:top w:type="dxa" w:w="80"/>
@@ -197,7 +197,7 @@
         </w:tc>
         <w:tc>
           <w:tcPr>
-            <w:tcW w:type="dxa" w:w="2016"/>
+            <w:tcW w:type="dxa" w:w="1814"/>
             <w:shd w:fill="1F3864" w:val="clear"/>
             <w:tcMar>
               <w:top w:type="dxa" w:w="80"/>
@@ -221,7 +221,7 @@
         </w:tc>
         <w:tc>
           <w:tcPr>
-            <w:tcW w:type="dxa" w:w="2722"/>
+            <w:tcW w:type="dxa" w:w="2822"/>
             <w:shd w:fill="1F3864" w:val="clear"/>
             <w:tcMar>
               <w:top w:type="dxa" w:w="80"/>
@@ -245,7 +245,7 @@
         </w:tc>
         <w:tc>
           <w:tcPr>
-            <w:tcW w:type="dxa" w:w="2722"/>
+            <w:tcW w:type="dxa" w:w="3024"/>
             <w:shd w:fill="1F3864" w:val="clear"/>
             <w:tcMar>
               <w:top w:type="dxa" w:w="80"/>
@@ -271,7 +271,7 @@
       <w:tr>
         <w:tc>
           <w:tcPr>
-            <w:tcW w:type="dxa" w:w="2621"/>
+            <w:tcW w:type="dxa" w:w="2419"/>
             <w:tcMar>
               <w:top w:type="dxa" w:w="80"/>
               <w:left w:type="dxa" w:w="100"/>
@@ -294,7 +294,7 @@
         </w:tc>
         <w:tc>
           <w:tcPr>
-            <w:tcW w:type="dxa" w:w="2016"/>
+            <w:tcW w:type="dxa" w:w="1814"/>
             <w:tcMar>
               <w:top w:type="dxa" w:w="80"/>
               <w:left w:type="dxa" w:w="100"/>
@@ -317,47 +317,47 @@
         </w:tc>
         <w:tc>
           <w:tcPr>
-            <w:tcW w:type="dxa" w:w="2722"/>
-            <w:tcMar>
-              <w:top w:type="dxa" w:w="80"/>
-              <w:left w:type="dxa" w:w="100"/>
-              <w:bottom w:type="dxa" w:w="80"/>
-              <w:right w:type="dxa" w:w="100"/>
-            </w:tcMar>
-          </w:tcPr>
-          <w:p>
-            <w:r>
-              <w:rPr>
-                <w:b w:val="false"/>
-                <w:bCs w:val="false"/>
-                <w:color w:val="000000"/>
-                <w:sz w:val="20"/>
-                <w:szCs w:val="20"/>
-              </w:rPr>
-              <w:t xml:space="preserve">PENDIENTE</w:t>
-            </w:r>
-          </w:p>
-        </w:tc>
-        <w:tc>
-          <w:tcPr>
-            <w:tcW w:type="dxa" w:w="2722"/>
-            <w:tcMar>
-              <w:top w:type="dxa" w:w="80"/>
-              <w:left w:type="dxa" w:w="100"/>
-              <w:bottom w:type="dxa" w:w="80"/>
-              <w:right w:type="dxa" w:w="100"/>
-            </w:tcMar>
-          </w:tcPr>
-          <w:p>
-            <w:r>
-              <w:rPr>
-                <w:b w:val="false"/>
-                <w:bCs w:val="false"/>
-                <w:color w:val="000000"/>
-                <w:sz w:val="20"/>
-                <w:szCs w:val="20"/>
-              </w:rPr>
-              <w:t xml:space="preserve">PENDIENTE</w:t>
+            <w:tcW w:type="dxa" w:w="2822"/>
+            <w:tcMar>
+              <w:top w:type="dxa" w:w="80"/>
+              <w:left w:type="dxa" w:w="100"/>
+              <w:bottom w:type="dxa" w:w="80"/>
+              <w:right w:type="dxa" w:w="100"/>
+            </w:tcMar>
+          </w:tcPr>
+          <w:p>
+            <w:r>
+              <w:rPr>
+                <w:b w:val="false"/>
+                <w:bCs w:val="false"/>
+                <w:color w:val="000000"/>
+                <w:sz w:val="20"/>
+                <w:szCs w:val="20"/>
+              </w:rPr>
+              <w:t xml:space="preserve">Responsables de diseñar, construir y sustentar el proyecto completo.</w:t>
+            </w:r>
+          </w:p>
+        </w:tc>
+        <w:tc>
+          <w:tcPr>
+            <w:tcW w:type="dxa" w:w="3024"/>
+            <w:tcMar>
+              <w:top w:type="dxa" w:w="80"/>
+              <w:left w:type="dxa" w:w="100"/>
+              <w:bottom w:type="dxa" w:w="80"/>
+              <w:right w:type="dxa" w:w="100"/>
+            </w:tcMar>
+          </w:tcPr>
+          <w:p>
+            <w:r>
+              <w:rPr>
+                <w:b w:val="false"/>
+                <w:bCs w:val="false"/>
+                <w:color w:val="000000"/>
+                <w:sz w:val="20"/>
+                <w:szCs w:val="20"/>
+              </w:rPr>
+              <w:t xml:space="preserve">Que el sistema sea técnicamente sólido y defendible, y quede terminado a tiempo para la entrega.</w:t>
             </w:r>
           </w:p>
         </w:tc>
@@ -365,7 +365,7 @@
       <w:tr>
         <w:tc>
           <w:tcPr>
-            <w:tcW w:type="dxa" w:w="2621"/>
+            <w:tcW w:type="dxa" w:w="2419"/>
             <w:tcMar>
               <w:top w:type="dxa" w:w="80"/>
               <w:left w:type="dxa" w:w="100"/>
@@ -388,7 +388,7 @@
         </w:tc>
         <w:tc>
           <w:tcPr>
-            <w:tcW w:type="dxa" w:w="2016"/>
+            <w:tcW w:type="dxa" w:w="1814"/>
             <w:tcMar>
               <w:top w:type="dxa" w:w="80"/>
               <w:left w:type="dxa" w:w="100"/>
@@ -411,47 +411,47 @@
         </w:tc>
         <w:tc>
           <w:tcPr>
-            <w:tcW w:type="dxa" w:w="2722"/>
-            <w:tcMar>
-              <w:top w:type="dxa" w:w="80"/>
-              <w:left w:type="dxa" w:w="100"/>
-              <w:bottom w:type="dxa" w:w="80"/>
-              <w:right w:type="dxa" w:w="100"/>
-            </w:tcMar>
-          </w:tcPr>
-          <w:p>
-            <w:r>
-              <w:rPr>
-                <w:b w:val="false"/>
-                <w:bCs w:val="false"/>
-                <w:color w:val="000000"/>
-                <w:sz w:val="20"/>
-                <w:szCs w:val="20"/>
-              </w:rPr>
-              <w:t xml:space="preserve">PENDIENTE</w:t>
-            </w:r>
-          </w:p>
-        </w:tc>
-        <w:tc>
-          <w:tcPr>
-            <w:tcW w:type="dxa" w:w="2722"/>
-            <w:tcMar>
-              <w:top w:type="dxa" w:w="80"/>
-              <w:left w:type="dxa" w:w="100"/>
-              <w:bottom w:type="dxa" w:w="80"/>
-              <w:right w:type="dxa" w:w="100"/>
-            </w:tcMar>
-          </w:tcPr>
-          <w:p>
-            <w:r>
-              <w:rPr>
-                <w:b w:val="false"/>
-                <w:bCs w:val="false"/>
-                <w:color w:val="000000"/>
-                <w:sz w:val="20"/>
-                <w:szCs w:val="20"/>
-              </w:rPr>
-              <w:t xml:space="preserve">PENDIENTE</w:t>
+            <w:tcW w:type="dxa" w:w="2822"/>
+            <w:tcMar>
+              <w:top w:type="dxa" w:w="80"/>
+              <w:left w:type="dxa" w:w="100"/>
+              <w:bottom w:type="dxa" w:w="80"/>
+              <w:right w:type="dxa" w:w="100"/>
+            </w:tcMar>
+          </w:tcPr>
+          <w:p>
+            <w:r>
+              <w:rPr>
+                <w:b w:val="false"/>
+                <w:bCs w:val="false"/>
+                <w:color w:val="000000"/>
+                <w:sz w:val="20"/>
+                <w:szCs w:val="20"/>
+              </w:rPr>
+              <w:t xml:space="preserve">Evalúa el rigor metodológico y técnico del proyecto durante su desarrollo.</w:t>
+            </w:r>
+          </w:p>
+        </w:tc>
+        <w:tc>
+          <w:tcPr>
+            <w:tcW w:type="dxa" w:w="3024"/>
+            <w:tcMar>
+              <w:top w:type="dxa" w:w="80"/>
+              <w:left w:type="dxa" w:w="100"/>
+              <w:bottom w:type="dxa" w:w="80"/>
+              <w:right w:type="dxa" w:w="100"/>
+            </w:tcMar>
+          </w:tcPr>
+          <w:p>
+            <w:r>
+              <w:rPr>
+                <w:b w:val="false"/>
+                <w:bCs w:val="false"/>
+                <w:color w:val="000000"/>
+                <w:sz w:val="20"/>
+                <w:szCs w:val="20"/>
+              </w:rPr>
+              <w:t xml:space="preserve">Que las decisiones de arquitectura estén justificadas y documentadas, no solo implementadas.</w:t>
             </w:r>
           </w:p>
         </w:tc>
@@ -459,7 +459,7 @@
       <w:tr>
         <w:tc>
           <w:tcPr>
-            <w:tcW w:type="dxa" w:w="2621"/>
+            <w:tcW w:type="dxa" w:w="2419"/>
             <w:tcMar>
               <w:top w:type="dxa" w:w="80"/>
               <w:left w:type="dxa" w:w="100"/>
@@ -482,7 +482,7 @@
         </w:tc>
         <w:tc>
           <w:tcPr>
-            <w:tcW w:type="dxa" w:w="2016"/>
+            <w:tcW w:type="dxa" w:w="1814"/>
             <w:tcMar>
               <w:top w:type="dxa" w:w="80"/>
               <w:left w:type="dxa" w:w="100"/>
@@ -505,47 +505,47 @@
         </w:tc>
         <w:tc>
           <w:tcPr>
-            <w:tcW w:type="dxa" w:w="2722"/>
-            <w:tcMar>
-              <w:top w:type="dxa" w:w="80"/>
-              <w:left w:type="dxa" w:w="100"/>
-              <w:bottom w:type="dxa" w:w="80"/>
-              <w:right w:type="dxa" w:w="100"/>
-            </w:tcMar>
-          </w:tcPr>
-          <w:p>
-            <w:r>
-              <w:rPr>
-                <w:b w:val="false"/>
-                <w:bCs w:val="false"/>
-                <w:color w:val="000000"/>
-                <w:sz w:val="20"/>
-                <w:szCs w:val="20"/>
-              </w:rPr>
-              <w:t xml:space="preserve">PENDIENTE</w:t>
-            </w:r>
-          </w:p>
-        </w:tc>
-        <w:tc>
-          <w:tcPr>
-            <w:tcW w:type="dxa" w:w="2722"/>
-            <w:tcMar>
-              <w:top w:type="dxa" w:w="80"/>
-              <w:left w:type="dxa" w:w="100"/>
-              <w:bottom w:type="dxa" w:w="80"/>
-              <w:right w:type="dxa" w:w="100"/>
-            </w:tcMar>
-          </w:tcPr>
-          <w:p>
-            <w:r>
-              <w:rPr>
-                <w:b w:val="false"/>
-                <w:bCs w:val="false"/>
-                <w:color w:val="000000"/>
-                <w:sz w:val="20"/>
-                <w:szCs w:val="20"/>
-              </w:rPr>
-              <w:t xml:space="preserve">PENDIENTE</w:t>
+            <w:tcW w:type="dxa" w:w="2822"/>
+            <w:tcMar>
+              <w:top w:type="dxa" w:w="80"/>
+              <w:left w:type="dxa" w:w="100"/>
+              <w:bottom w:type="dxa" w:w="80"/>
+              <w:right w:type="dxa" w:w="100"/>
+            </w:tcMar>
+          </w:tcPr>
+          <w:p>
+            <w:r>
+              <w:rPr>
+                <w:b w:val="false"/>
+                <w:bCs w:val="false"/>
+                <w:color w:val="000000"/>
+                <w:sz w:val="20"/>
+                <w:szCs w:val="20"/>
+              </w:rPr>
+              <w:t xml:space="preserve">Reciben alertas y consultan nivel de riesgo para decidir sus desplazamientos.</w:t>
+            </w:r>
+          </w:p>
+        </w:tc>
+        <w:tc>
+          <w:tcPr>
+            <w:tcW w:type="dxa" w:w="3024"/>
+            <w:tcMar>
+              <w:top w:type="dxa" w:w="80"/>
+              <w:left w:type="dxa" w:w="100"/>
+              <w:bottom w:type="dxa" w:w="80"/>
+              <w:right w:type="dxa" w:w="100"/>
+            </w:tcMar>
+          </w:tcPr>
+          <w:p>
+            <w:r>
+              <w:rPr>
+                <w:b w:val="false"/>
+                <w:bCs w:val="false"/>
+                <w:color w:val="000000"/>
+                <w:sz w:val="20"/>
+                <w:szCs w:val="20"/>
+              </w:rPr>
+              <w:t xml:space="preserve">Que la información sea confiable y oportuna, y que su ubicación no se exponga indebidamente (sin autenticación hoy, ver sección 6).</w:t>
             </w:r>
           </w:p>
         </w:tc>
@@ -553,7 +553,7 @@
       <w:tr>
         <w:tc>
           <w:tcPr>
-            <w:tcW w:type="dxa" w:w="2621"/>
+            <w:tcW w:type="dxa" w:w="2419"/>
             <w:tcMar>
               <w:top w:type="dxa" w:w="80"/>
               <w:left w:type="dxa" w:w="100"/>
@@ -576,7 +576,7 @@
         </w:tc>
         <w:tc>
           <w:tcPr>
-            <w:tcW w:type="dxa" w:w="2016"/>
+            <w:tcW w:type="dxa" w:w="1814"/>
             <w:tcMar>
               <w:top w:type="dxa" w:w="80"/>
               <w:left w:type="dxa" w:w="100"/>
@@ -599,47 +599,47 @@
         </w:tc>
         <w:tc>
           <w:tcPr>
-            <w:tcW w:type="dxa" w:w="2722"/>
-            <w:tcMar>
-              <w:top w:type="dxa" w:w="80"/>
-              <w:left w:type="dxa" w:w="100"/>
-              <w:bottom w:type="dxa" w:w="80"/>
-              <w:right w:type="dxa" w:w="100"/>
-            </w:tcMar>
-          </w:tcPr>
-          <w:p>
-            <w:r>
-              <w:rPr>
-                <w:b w:val="false"/>
-                <w:bCs w:val="false"/>
-                <w:color w:val="000000"/>
-                <w:sz w:val="20"/>
-                <w:szCs w:val="20"/>
-              </w:rPr>
-              <w:t xml:space="preserve">PENDIENTE</w:t>
-            </w:r>
-          </w:p>
-        </w:tc>
-        <w:tc>
-          <w:tcPr>
-            <w:tcW w:type="dxa" w:w="2722"/>
-            <w:tcMar>
-              <w:top w:type="dxa" w:w="80"/>
-              <w:left w:type="dxa" w:w="100"/>
-              <w:bottom w:type="dxa" w:w="80"/>
-              <w:right w:type="dxa" w:w="100"/>
-            </w:tcMar>
-          </w:tcPr>
-          <w:p>
-            <w:r>
-              <w:rPr>
-                <w:b w:val="false"/>
-                <w:bCs w:val="false"/>
-                <w:color w:val="000000"/>
-                <w:sz w:val="20"/>
-                <w:szCs w:val="20"/>
-              </w:rPr>
-              <w:t xml:space="preserve">PENDIENTE</w:t>
+            <w:tcW w:type="dxa" w:w="2822"/>
+            <w:tcMar>
+              <w:top w:type="dxa" w:w="80"/>
+              <w:left w:type="dxa" w:w="100"/>
+              <w:bottom w:type="dxa" w:w="80"/>
+              <w:right w:type="dxa" w:w="100"/>
+            </w:tcMar>
+          </w:tcPr>
+          <w:p>
+            <w:r>
+              <w:rPr>
+                <w:b w:val="false"/>
+                <w:bCs w:val="false"/>
+                <w:color w:val="000000"/>
+                <w:sz w:val="20"/>
+                <w:szCs w:val="20"/>
+              </w:rPr>
+              <w:t xml:space="preserve">Sus datasets abiertos (delitos, llamadas NUSE, etc.) son el insumo primario del sistema.</w:t>
+            </w:r>
+          </w:p>
+        </w:tc>
+        <w:tc>
+          <w:tcPr>
+            <w:tcW w:type="dxa" w:w="3024"/>
+            <w:tcMar>
+              <w:top w:type="dxa" w:w="80"/>
+              <w:left w:type="dxa" w:w="100"/>
+              <w:bottom w:type="dxa" w:w="80"/>
+              <w:right w:type="dxa" w:w="100"/>
+            </w:tcMar>
+          </w:tcPr>
+          <w:p>
+            <w:r>
+              <w:rPr>
+                <w:b w:val="false"/>
+                <w:bCs w:val="false"/>
+                <w:color w:val="000000"/>
+                <w:sz w:val="20"/>
+                <w:szCs w:val="20"/>
+              </w:rPr>
+              <w:t xml:space="preserve">Que sus datos no se tergiversen ni se tache de cifra 'oficial de la Secretaría' algo que es una reinterpretación propia del equipo (ver notas éticas en ProcesarRiesgo.py).</w:t>
             </w:r>
           </w:p>
         </w:tc>
@@ -647,7 +647,7 @@
       <w:tr>
         <w:tc>
           <w:tcPr>
-            <w:tcW w:type="dxa" w:w="2621"/>
+            <w:tcW w:type="dxa" w:w="2419"/>
             <w:tcMar>
               <w:top w:type="dxa" w:w="80"/>
               <w:left w:type="dxa" w:w="100"/>
@@ -670,7 +670,7 @@
         </w:tc>
         <w:tc>
           <w:tcPr>
-            <w:tcW w:type="dxa" w:w="2016"/>
+            <w:tcW w:type="dxa" w:w="1814"/>
             <w:tcMar>
               <w:top w:type="dxa" w:w="80"/>
               <w:left w:type="dxa" w:w="100"/>
@@ -693,76 +693,52 @@
         </w:tc>
         <w:tc>
           <w:tcPr>
-            <w:tcW w:type="dxa" w:w="2722"/>
-            <w:tcMar>
-              <w:top w:type="dxa" w:w="80"/>
-              <w:left w:type="dxa" w:w="100"/>
-              <w:bottom w:type="dxa" w:w="80"/>
-              <w:right w:type="dxa" w:w="100"/>
-            </w:tcMar>
-          </w:tcPr>
-          <w:p>
-            <w:r>
-              <w:rPr>
-                <w:b w:val="false"/>
-                <w:bCs w:val="false"/>
-                <w:color w:val="000000"/>
-                <w:sz w:val="20"/>
-                <w:szCs w:val="20"/>
-              </w:rPr>
-              <w:t xml:space="preserve">PENDIENTE</w:t>
-            </w:r>
-          </w:p>
-        </w:tc>
-        <w:tc>
-          <w:tcPr>
-            <w:tcW w:type="dxa" w:w="2722"/>
-            <w:tcMar>
-              <w:top w:type="dxa" w:w="80"/>
-              <w:left w:type="dxa" w:w="100"/>
-              <w:bottom w:type="dxa" w:w="80"/>
-              <w:right w:type="dxa" w:w="100"/>
-            </w:tcMar>
-          </w:tcPr>
-          <w:p>
-            <w:r>
-              <w:rPr>
-                <w:b w:val="false"/>
-                <w:bCs w:val="false"/>
-                <w:color w:val="000000"/>
-                <w:sz w:val="20"/>
-                <w:szCs w:val="20"/>
-              </w:rPr>
-              <w:t xml:space="preserve">PENDIENTE</w:t>
+            <w:tcW w:type="dxa" w:w="2822"/>
+            <w:tcMar>
+              <w:top w:type="dxa" w:w="80"/>
+              <w:left w:type="dxa" w:w="100"/>
+              <w:bottom w:type="dxa" w:w="80"/>
+              <w:right w:type="dxa" w:w="100"/>
+            </w:tcMar>
+          </w:tcPr>
+          <w:p>
+            <w:r>
+              <w:rPr>
+                <w:b w:val="false"/>
+                <w:bCs w:val="false"/>
+                <w:color w:val="000000"/>
+                <w:sz w:val="20"/>
+                <w:szCs w:val="20"/>
+              </w:rPr>
+              <w:t xml:space="preserve">Respalda el proyecto como trabajo de grado y aplica el estándar de arquitectura de la facultad.</w:t>
+            </w:r>
+          </w:p>
+        </w:tc>
+        <w:tc>
+          <w:tcPr>
+            <w:tcW w:type="dxa" w:w="3024"/>
+            <w:tcMar>
+              <w:top w:type="dxa" w:w="80"/>
+              <w:left w:type="dxa" w:w="100"/>
+              <w:bottom w:type="dxa" w:w="80"/>
+              <w:right w:type="dxa" w:w="100"/>
+            </w:tcMar>
+          </w:tcPr>
+          <w:p>
+            <w:r>
+              <w:rPr>
+                <w:b w:val="false"/>
+                <w:bCs w:val="false"/>
+                <w:color w:val="000000"/>
+                <w:sz w:val="20"/>
+                <w:szCs w:val="20"/>
+              </w:rPr>
+              <w:t xml:space="preserve">Que el proyecto cumpla el Documento de Arquitectura de Software exigido y sea un caso de estudio presentable.</w:t>
             </w:r>
           </w:p>
         </w:tc>
       </w:tr>
     </w:tbl>
-    <w:p>
-      <w:pPr>
-        <w:pBdr>
-          <w:left w:val="single" w:color="B45309" w:sz="24"/>
-        </w:pBdr>
-        <w:shd w:fill="FFF4E5" w:val="clear"/>
-        <w:spacing w:after="200" w:before="100"/>
-        <w:ind w:left="180"/>
-      </w:pPr>
-      <w:r>
-        <w:rPr>
-          <w:b/>
-          <w:bCs/>
-          <w:color w:val="B45309"/>
-        </w:rPr>
-        <w:t xml:space="preserve">PENDIENTE — </w:t>
-      </w:r>
-      <w:r>
-        <w:rPr>
-          <w:color w:val="5A3E1B"/>
-        </w:rPr>
-        <w:t xml:space="preserve">Confirmar si faltan partes interesadas (¿JAC / organizaciones comunitarias, dado que se usa osb_detsoc_revcom.csv? ¿Policía/autoridades locales?) y completar afectación y preocupación de cada fila.</w:t>
-      </w:r>
-    </w:p>
     <w:p>
       <w:pPr>
         <w:pStyle w:val="Heading2"/>
@@ -8066,7 +8042,7 @@
           <w:sz w:val="20"/>
           <w:szCs w:val="20"/>
         </w:rPr>
-        <w:t xml:space="preserve">Candidatos a atributo de calidad detectados por lo que el código prioriza. Falta que el equipo asigne Alta/Media/Baja — es una decisión de negocio, no técnica.</w:t>
+        <w:t xml:space="preserve">El equipo decidió explícitamente (2026-10-19) NO priorizar un atributo sobre otro: los cinco se tratan como igual de importantes (Alta). Es una postura válida -- no todos los proyectos necesitan un solo atributo dominante -- pero tiene una consecuencia real: sin un orden de prioridad, un trade-off entre dos atributos (ej. seguridad vs. velocidad de respuesta) no tiene un criterio de desempate documentado más allá del juicio del equipo caso por caso.</w:t>
       </w:r>
     </w:p>
     <w:tbl>
@@ -8277,7 +8253,7 @@
                 <w:sz w:val="20"/>
                 <w:szCs w:val="20"/>
               </w:rPr>
-              <w:t xml:space="preserve">PENDIENTE</w:t>
+              <w:t xml:space="preserve">Alta</w:t>
             </w:r>
           </w:p>
         </w:tc>
@@ -8371,7 +8347,7 @@
                 <w:sz w:val="20"/>
                 <w:szCs w:val="20"/>
               </w:rPr>
-              <w:t xml:space="preserve">PENDIENTE</w:t>
+              <w:t xml:space="preserve">Alta</w:t>
             </w:r>
           </w:p>
         </w:tc>
@@ -8465,7 +8441,7 @@
                 <w:sz w:val="20"/>
                 <w:szCs w:val="20"/>
               </w:rPr>
-              <w:t xml:space="preserve">PENDIENTE</w:t>
+              <w:t xml:space="preserve">Alta</w:t>
             </w:r>
           </w:p>
         </w:tc>
@@ -8559,7 +8535,7 @@
                 <w:sz w:val="20"/>
                 <w:szCs w:val="20"/>
               </w:rPr>
-              <w:t xml:space="preserve">PENDIENTE</w:t>
+              <w:t xml:space="preserve">Alta</w:t>
             </w:r>
           </w:p>
         </w:tc>
@@ -8653,7 +8629,7 @@
                 <w:sz w:val="20"/>
                 <w:szCs w:val="20"/>
               </w:rPr>
-              <w:t xml:space="preserve">PENDIENTE</w:t>
+              <w:t xml:space="preserve">Alta</w:t>
             </w:r>
           </w:p>
         </w:tc>
@@ -8682,30 +8658,736 @@
         <w:t xml:space="preserve">   [Tipo: Matriz]</w:t>
       </w:r>
     </w:p>
-    <w:p>
-      <w:pPr>
-        <w:pBdr>
-          <w:left w:val="single" w:color="B45309" w:sz="24"/>
-        </w:pBdr>
-        <w:shd w:fill="FFF4E5" w:val="clear"/>
-        <w:spacing w:after="200" w:before="100"/>
-        <w:ind w:left="180"/>
-      </w:pPr>
-      <w:r>
-        <w:rPr>
-          <w:b/>
-          <w:bCs/>
-          <w:color w:val="B45309"/>
-        </w:rPr>
-        <w:t xml:space="preserve">PENDIENTE — </w:t>
-      </w:r>
-      <w:r>
-        <w:rPr>
-          <w:color w:val="5A3E1B"/>
-        </w:rPr>
-        <w:t xml:space="preserve">Depende directamente de que 2.2 y 2.3 estén completos con prioridades reales del equipo (no se puede derivar del código qué tan importante es cada atributo para la sustentación).</w:t>
-      </w:r>
-    </w:p>
+    <w:tbl>
+      <w:tblPr>
+        <w:tblW w:type="dxa" w:w="10080"/>
+        <w:tblBorders>
+          <w:top w:val="single" w:color="auto" w:sz="4"/>
+          <w:left w:val="single" w:color="auto" w:sz="4"/>
+          <w:bottom w:val="single" w:color="auto" w:sz="4"/>
+          <w:right w:val="single" w:color="auto" w:sz="4"/>
+          <w:insideH w:val="single" w:color="auto" w:sz="4"/>
+          <w:insideV w:val="single" w:color="auto" w:sz="4"/>
+        </w:tblBorders>
+      </w:tblPr>
+      <w:tblGrid>
+        <w:gridCol w:w="806"/>
+        <w:gridCol w:w="1613"/>
+        <w:gridCol w:w="1411"/>
+        <w:gridCol w:w="2016"/>
+        <w:gridCol w:w="2016"/>
+        <w:gridCol w:w="2218"/>
+      </w:tblGrid>
+      <w:tr>
+        <w:trPr>
+          <w:tblHeader/>
+        </w:trPr>
+        <w:tc>
+          <w:tcPr>
+            <w:tcW w:type="dxa" w:w="806"/>
+            <w:shd w:fill="1F3864" w:val="clear"/>
+            <w:tcMar>
+              <w:top w:type="dxa" w:w="80"/>
+              <w:left w:type="dxa" w:w="100"/>
+              <w:bottom w:type="dxa" w:w="80"/>
+              <w:right w:type="dxa" w:w="100"/>
+            </w:tcMar>
+          </w:tcPr>
+          <w:p>
+            <w:r>
+              <w:rPr>
+                <w:b/>
+                <w:bCs/>
+                <w:color w:val="FFFFFF"/>
+                <w:sz w:val="20"/>
+                <w:szCs w:val="20"/>
+              </w:rPr>
+              <w:t xml:space="preserve">ID</w:t>
+            </w:r>
+          </w:p>
+        </w:tc>
+        <w:tc>
+          <w:tcPr>
+            <w:tcW w:type="dxa" w:w="1613"/>
+            <w:shd w:fill="1F3864" w:val="clear"/>
+            <w:tcMar>
+              <w:top w:type="dxa" w:w="80"/>
+              <w:left w:type="dxa" w:w="100"/>
+              <w:bottom w:type="dxa" w:w="80"/>
+              <w:right w:type="dxa" w:w="100"/>
+            </w:tcMar>
+          </w:tcPr>
+          <w:p>
+            <w:r>
+              <w:rPr>
+                <w:b/>
+                <w:bCs/>
+                <w:color w:val="FFFFFF"/>
+                <w:sz w:val="20"/>
+                <w:szCs w:val="20"/>
+              </w:rPr>
+              <w:t xml:space="preserve">Escenario de origen</w:t>
+            </w:r>
+          </w:p>
+        </w:tc>
+        <w:tc>
+          <w:tcPr>
+            <w:tcW w:type="dxa" w:w="1411"/>
+            <w:shd w:fill="1F3864" w:val="clear"/>
+            <w:tcMar>
+              <w:top w:type="dxa" w:w="80"/>
+              <w:left w:type="dxa" w:w="100"/>
+              <w:bottom w:type="dxa" w:w="80"/>
+              <w:right w:type="dxa" w:w="100"/>
+            </w:tcMar>
+          </w:tcPr>
+          <w:p>
+            <w:r>
+              <w:rPr>
+                <w:b/>
+                <w:bCs/>
+                <w:color w:val="FFFFFF"/>
+                <w:sz w:val="20"/>
+                <w:szCs w:val="20"/>
+              </w:rPr>
+              <w:t xml:space="preserve">Valoración (Utility Tree)</w:t>
+            </w:r>
+          </w:p>
+        </w:tc>
+        <w:tc>
+          <w:tcPr>
+            <w:tcW w:type="dxa" w:w="2016"/>
+            <w:shd w:fill="1F3864" w:val="clear"/>
+            <w:tcMar>
+              <w:top w:type="dxa" w:w="80"/>
+              <w:left w:type="dxa" w:w="100"/>
+              <w:bottom w:type="dxa" w:w="80"/>
+              <w:right w:type="dxa" w:w="100"/>
+            </w:tcMar>
+          </w:tcPr>
+          <w:p>
+            <w:r>
+              <w:rPr>
+                <w:b/>
+                <w:bCs/>
+                <w:color w:val="FFFFFF"/>
+                <w:sz w:val="20"/>
+                <w:szCs w:val="20"/>
+              </w:rPr>
+              <w:t xml:space="preserve">Elemento arquitectónico afectado</w:t>
+            </w:r>
+          </w:p>
+        </w:tc>
+        <w:tc>
+          <w:tcPr>
+            <w:tcW w:type="dxa" w:w="2016"/>
+            <w:shd w:fill="1F3864" w:val="clear"/>
+            <w:tcMar>
+              <w:top w:type="dxa" w:w="80"/>
+              <w:left w:type="dxa" w:w="100"/>
+              <w:bottom w:type="dxa" w:w="80"/>
+              <w:right w:type="dxa" w:w="100"/>
+            </w:tcMar>
+          </w:tcPr>
+          <w:p>
+            <w:r>
+              <w:rPr>
+                <w:b/>
+                <w:bCs/>
+                <w:color w:val="FFFFFF"/>
+                <w:sz w:val="20"/>
+                <w:szCs w:val="20"/>
+              </w:rPr>
+              <w:t xml:space="preserve">Dictamen</w:t>
+            </w:r>
+          </w:p>
+        </w:tc>
+        <w:tc>
+          <w:tcPr>
+            <w:tcW w:type="dxa" w:w="2218"/>
+            <w:shd w:fill="1F3864" w:val="clear"/>
+            <w:tcMar>
+              <w:top w:type="dxa" w:w="80"/>
+              <w:left w:type="dxa" w:w="100"/>
+              <w:bottom w:type="dxa" w:w="80"/>
+              <w:right w:type="dxa" w:w="100"/>
+            </w:tcMar>
+          </w:tcPr>
+          <w:p>
+            <w:r>
+              <w:rPr>
+                <w:b/>
+                <w:bCs/>
+                <w:color w:val="FFFFFF"/>
+                <w:sz w:val="20"/>
+                <w:szCs w:val="20"/>
+              </w:rPr>
+              <w:t xml:space="preserve">Decisión que obliga</w:t>
+            </w:r>
+          </w:p>
+        </w:tc>
+      </w:tr>
+      <w:tr>
+        <w:tc>
+          <w:tcPr>
+            <w:tcW w:type="dxa" w:w="806"/>
+            <w:tcMar>
+              <w:top w:type="dxa" w:w="80"/>
+              <w:left w:type="dxa" w:w="100"/>
+              <w:bottom w:type="dxa" w:w="80"/>
+              <w:right w:type="dxa" w:w="100"/>
+            </w:tcMar>
+          </w:tcPr>
+          <w:p>
+            <w:r>
+              <w:rPr>
+                <w:b w:val="false"/>
+                <w:bCs w:val="false"/>
+                <w:color w:val="000000"/>
+                <w:sz w:val="20"/>
+                <w:szCs w:val="20"/>
+              </w:rPr>
+              <w:t xml:space="preserve">ASR-01</w:t>
+            </w:r>
+          </w:p>
+        </w:tc>
+        <w:tc>
+          <w:tcPr>
+            <w:tcW w:type="dxa" w:w="1613"/>
+            <w:tcMar>
+              <w:top w:type="dxa" w:w="80"/>
+              <w:left w:type="dxa" w:w="100"/>
+              <w:bottom w:type="dxa" w:w="80"/>
+              <w:right w:type="dxa" w:w="100"/>
+            </w:tcMar>
+          </w:tcPr>
+          <w:p>
+            <w:r>
+              <w:rPr>
+                <w:b w:val="false"/>
+                <w:bCs w:val="false"/>
+                <w:color w:val="000000"/>
+                <w:sz w:val="20"/>
+                <w:szCs w:val="20"/>
+              </w:rPr>
+              <w:t xml:space="preserve">ESC-01 (desempeño del chat)</w:t>
+            </w:r>
+          </w:p>
+        </w:tc>
+        <w:tc>
+          <w:tcPr>
+            <w:tcW w:type="dxa" w:w="1411"/>
+            <w:tcMar>
+              <w:top w:type="dxa" w:w="80"/>
+              <w:left w:type="dxa" w:w="100"/>
+              <w:bottom w:type="dxa" w:w="80"/>
+              <w:right w:type="dxa" w:w="100"/>
+            </w:tcMar>
+          </w:tcPr>
+          <w:p>
+            <w:r>
+              <w:rPr>
+                <w:b w:val="false"/>
+                <w:bCs w:val="false"/>
+                <w:color w:val="000000"/>
+                <w:sz w:val="20"/>
+                <w:szCs w:val="20"/>
+              </w:rPr>
+              <w:t xml:space="preserve">Alta</w:t>
+            </w:r>
+          </w:p>
+        </w:tc>
+        <w:tc>
+          <w:tcPr>
+            <w:tcW w:type="dxa" w:w="2016"/>
+            <w:tcMar>
+              <w:top w:type="dxa" w:w="80"/>
+              <w:left w:type="dxa" w:w="100"/>
+              <w:bottom w:type="dxa" w:w="80"/>
+              <w:right w:type="dxa" w:w="100"/>
+            </w:tcMar>
+          </w:tcPr>
+          <w:p>
+            <w:r>
+              <w:rPr>
+                <w:b w:val="false"/>
+                <w:bCs w:val="false"/>
+                <w:color w:val="000000"/>
+                <w:sz w:val="20"/>
+                <w:szCs w:val="20"/>
+              </w:rPr>
+              <w:t xml:space="preserve">Api/backend_riesgo.py + Ollama</w:t>
+            </w:r>
+          </w:p>
+        </w:tc>
+        <w:tc>
+          <w:tcPr>
+            <w:tcW w:type="dxa" w:w="2016"/>
+            <w:tcMar>
+              <w:top w:type="dxa" w:w="80"/>
+              <w:left w:type="dxa" w:w="100"/>
+              <w:bottom w:type="dxa" w:w="80"/>
+              <w:right w:type="dxa" w:w="100"/>
+            </w:tcMar>
+          </w:tcPr>
+          <w:p>
+            <w:r>
+              <w:rPr>
+                <w:b w:val="false"/>
+                <w:bCs w:val="false"/>
+                <w:color w:val="000000"/>
+                <w:sz w:val="20"/>
+                <w:szCs w:val="20"/>
+              </w:rPr>
+              <w:t xml:space="preserve">Riesgo: sin un objetivo numérico de latencia, el timeout de 100s es arbitrario, no derivado de una medición real.</w:t>
+            </w:r>
+          </w:p>
+        </w:tc>
+        <w:tc>
+          <w:tcPr>
+            <w:tcW w:type="dxa" w:w="2218"/>
+            <w:tcMar>
+              <w:top w:type="dxa" w:w="80"/>
+              <w:left w:type="dxa" w:w="100"/>
+              <w:bottom w:type="dxa" w:w="80"/>
+              <w:right w:type="dxa" w:w="100"/>
+            </w:tcMar>
+          </w:tcPr>
+          <w:p>
+            <w:r>
+              <w:rPr>
+                <w:b w:val="false"/>
+                <w:bCs w:val="false"/>
+                <w:color w:val="000000"/>
+                <w:sz w:val="20"/>
+                <w:szCs w:val="20"/>
+              </w:rPr>
+              <w:t xml:space="preserve">Definir y medir un p95 de latencia objetivo antes de la entrega; documentar el resultado aquí.</w:t>
+            </w:r>
+          </w:p>
+        </w:tc>
+      </w:tr>
+      <w:tr>
+        <w:tc>
+          <w:tcPr>
+            <w:tcW w:type="dxa" w:w="806"/>
+            <w:tcMar>
+              <w:top w:type="dxa" w:w="80"/>
+              <w:left w:type="dxa" w:w="100"/>
+              <w:bottom w:type="dxa" w:w="80"/>
+              <w:right w:type="dxa" w:w="100"/>
+            </w:tcMar>
+          </w:tcPr>
+          <w:p>
+            <w:r>
+              <w:rPr>
+                <w:b w:val="false"/>
+                <w:bCs w:val="false"/>
+                <w:color w:val="000000"/>
+                <w:sz w:val="20"/>
+                <w:szCs w:val="20"/>
+              </w:rPr>
+              <w:t xml:space="preserve">ASR-02</w:t>
+            </w:r>
+          </w:p>
+        </w:tc>
+        <w:tc>
+          <w:tcPr>
+            <w:tcW w:type="dxa" w:w="1613"/>
+            <w:tcMar>
+              <w:top w:type="dxa" w:w="80"/>
+              <w:left w:type="dxa" w:w="100"/>
+              <w:bottom w:type="dxa" w:w="80"/>
+              <w:right w:type="dxa" w:w="100"/>
+            </w:tcMar>
+          </w:tcPr>
+          <w:p>
+            <w:r>
+              <w:rPr>
+                <w:b w:val="false"/>
+                <w:bCs w:val="false"/>
+                <w:color w:val="000000"/>
+                <w:sz w:val="20"/>
+                <w:szCs w:val="20"/>
+              </w:rPr>
+              <w:t xml:space="preserve">ESC-02 (disponibilidad del pipeline)</w:t>
+            </w:r>
+          </w:p>
+        </w:tc>
+        <w:tc>
+          <w:tcPr>
+            <w:tcW w:type="dxa" w:w="1411"/>
+            <w:tcMar>
+              <w:top w:type="dxa" w:w="80"/>
+              <w:left w:type="dxa" w:w="100"/>
+              <w:bottom w:type="dxa" w:w="80"/>
+              <w:right w:type="dxa" w:w="100"/>
+            </w:tcMar>
+          </w:tcPr>
+          <w:p>
+            <w:r>
+              <w:rPr>
+                <w:b w:val="false"/>
+                <w:bCs w:val="false"/>
+                <w:color w:val="000000"/>
+                <w:sz w:val="20"/>
+                <w:szCs w:val="20"/>
+              </w:rPr>
+              <w:t xml:space="preserve">Alta</w:t>
+            </w:r>
+          </w:p>
+        </w:tc>
+        <w:tc>
+          <w:tcPr>
+            <w:tcW w:type="dxa" w:w="2016"/>
+            <w:tcMar>
+              <w:top w:type="dxa" w:w="80"/>
+              <w:left w:type="dxa" w:w="100"/>
+              <w:bottom w:type="dxa" w:w="80"/>
+              <w:right w:type="dxa" w:w="100"/>
+            </w:tcMar>
+          </w:tcPr>
+          <w:p>
+            <w:r>
+              <w:rPr>
+                <w:b w:val="false"/>
+                <w:bCs w:val="false"/>
+                <w:color w:val="000000"/>
+                <w:sz w:val="20"/>
+                <w:szCs w:val="20"/>
+              </w:rPr>
+              <w:t xml:space="preserve">Agente/ProcesarRiesgo.py</w:t>
+            </w:r>
+          </w:p>
+        </w:tc>
+        <w:tc>
+          <w:tcPr>
+            <w:tcW w:type="dxa" w:w="2016"/>
+            <w:tcMar>
+              <w:top w:type="dxa" w:w="80"/>
+              <w:left w:type="dxa" w:w="100"/>
+              <w:bottom w:type="dxa" w:w="80"/>
+              <w:right w:type="dxa" w:w="100"/>
+            </w:tcMar>
+          </w:tcPr>
+          <w:p>
+            <w:r>
+              <w:rPr>
+                <w:b w:val="false"/>
+                <w:bCs w:val="false"/>
+                <w:color w:val="000000"/>
+                <w:sz w:val="20"/>
+                <w:szCs w:val="20"/>
+              </w:rPr>
+              <w:t xml:space="preserve">Satisfecho: cada fuente opcional ya se maneja con try/except y deja el campo en null sin tumbar el pipeline.</w:t>
+            </w:r>
+          </w:p>
+        </w:tc>
+        <w:tc>
+          <w:tcPr>
+            <w:tcW w:type="dxa" w:w="2218"/>
+            <w:tcMar>
+              <w:top w:type="dxa" w:w="80"/>
+              <w:left w:type="dxa" w:w="100"/>
+              <w:bottom w:type="dxa" w:w="80"/>
+              <w:right w:type="dxa" w:w="100"/>
+            </w:tcMar>
+          </w:tcPr>
+          <w:p>
+            <w:r>
+              <w:rPr>
+                <w:b w:val="false"/>
+                <w:bCs w:val="false"/>
+                <w:color w:val="000000"/>
+                <w:sz w:val="20"/>
+                <w:szCs w:val="20"/>
+              </w:rPr>
+              <w:t xml:space="preserve">Ninguna acción adicional; mantener el patrón al agregar fuentes nuevas.</w:t>
+            </w:r>
+          </w:p>
+        </w:tc>
+      </w:tr>
+      <w:tr>
+        <w:tc>
+          <w:tcPr>
+            <w:tcW w:type="dxa" w:w="806"/>
+            <w:tcMar>
+              <w:top w:type="dxa" w:w="80"/>
+              <w:left w:type="dxa" w:w="100"/>
+              <w:bottom w:type="dxa" w:w="80"/>
+              <w:right w:type="dxa" w:w="100"/>
+            </w:tcMar>
+          </w:tcPr>
+          <w:p>
+            <w:r>
+              <w:rPr>
+                <w:b w:val="false"/>
+                <w:bCs w:val="false"/>
+                <w:color w:val="000000"/>
+                <w:sz w:val="20"/>
+                <w:szCs w:val="20"/>
+              </w:rPr>
+              <w:t xml:space="preserve">ASR-03</w:t>
+            </w:r>
+          </w:p>
+        </w:tc>
+        <w:tc>
+          <w:tcPr>
+            <w:tcW w:type="dxa" w:w="1613"/>
+            <w:tcMar>
+              <w:top w:type="dxa" w:w="80"/>
+              <w:left w:type="dxa" w:w="100"/>
+              <w:bottom w:type="dxa" w:w="80"/>
+              <w:right w:type="dxa" w:w="100"/>
+            </w:tcMar>
+          </w:tcPr>
+          <w:p>
+            <w:r>
+              <w:rPr>
+                <w:b w:val="false"/>
+                <w:bCs w:val="false"/>
+                <w:color w:val="000000"/>
+                <w:sz w:val="20"/>
+                <w:szCs w:val="20"/>
+              </w:rPr>
+              <w:t xml:space="preserve">ESC-03 (exactitud del agente)</w:t>
+            </w:r>
+          </w:p>
+        </w:tc>
+        <w:tc>
+          <w:tcPr>
+            <w:tcW w:type="dxa" w:w="1411"/>
+            <w:tcMar>
+              <w:top w:type="dxa" w:w="80"/>
+              <w:left w:type="dxa" w:w="100"/>
+              <w:bottom w:type="dxa" w:w="80"/>
+              <w:right w:type="dxa" w:w="100"/>
+            </w:tcMar>
+          </w:tcPr>
+          <w:p>
+            <w:r>
+              <w:rPr>
+                <w:b w:val="false"/>
+                <w:bCs w:val="false"/>
+                <w:color w:val="000000"/>
+                <w:sz w:val="20"/>
+                <w:szCs w:val="20"/>
+              </w:rPr>
+              <w:t xml:space="preserve">Alta</w:t>
+            </w:r>
+          </w:p>
+        </w:tc>
+        <w:tc>
+          <w:tcPr>
+            <w:tcW w:type="dxa" w:w="2016"/>
+            <w:tcMar>
+              <w:top w:type="dxa" w:w="80"/>
+              <w:left w:type="dxa" w:w="100"/>
+              <w:bottom w:type="dxa" w:w="80"/>
+              <w:right w:type="dxa" w:w="100"/>
+            </w:tcMar>
+          </w:tcPr>
+          <w:p>
+            <w:r>
+              <w:rPr>
+                <w:b w:val="false"/>
+                <w:bCs w:val="false"/>
+                <w:color w:val="000000"/>
+                <w:sz w:val="20"/>
+                <w:szCs w:val="20"/>
+              </w:rPr>
+              <w:t xml:space="preserve">Api/backend_riesgo.py (preguntar())</w:t>
+            </w:r>
+          </w:p>
+        </w:tc>
+        <w:tc>
+          <w:tcPr>
+            <w:tcW w:type="dxa" w:w="2016"/>
+            <w:tcMar>
+              <w:top w:type="dxa" w:w="80"/>
+              <w:left w:type="dxa" w:w="100"/>
+              <w:bottom w:type="dxa" w:w="80"/>
+              <w:right w:type="dxa" w:w="100"/>
+            </w:tcMar>
+          </w:tcPr>
+          <w:p>
+            <w:r>
+              <w:rPr>
+                <w:b w:val="false"/>
+                <w:bCs w:val="false"/>
+                <w:color w:val="000000"/>
+                <w:sz w:val="20"/>
+                <w:szCs w:val="20"/>
+              </w:rPr>
+              <w:t xml:space="preserve">Satisfecho: tool-calling obligatorio + filtro de post-procesamiento que recorta tasas inventadas (quitar_tasas_inventadas).</w:t>
+            </w:r>
+          </w:p>
+        </w:tc>
+        <w:tc>
+          <w:tcPr>
+            <w:tcW w:type="dxa" w:w="2218"/>
+            <w:tcMar>
+              <w:top w:type="dxa" w:w="80"/>
+              <w:left w:type="dxa" w:w="100"/>
+              <w:bottom w:type="dxa" w:w="80"/>
+              <w:right w:type="dxa" w:w="100"/>
+            </w:tcMar>
+          </w:tcPr>
+          <w:p>
+            <w:r>
+              <w:rPr>
+                <w:b w:val="false"/>
+                <w:bCs w:val="false"/>
+                <w:color w:val="000000"/>
+                <w:sz w:val="20"/>
+                <w:szCs w:val="20"/>
+              </w:rPr>
+              <w:t xml:space="preserve">Ninguna acción adicional; extender el filtro si aparecen nuevos campos "*_recientes_total" (ya se hizo para los campos agregados en la sesión de datos NUSE/OSB).</w:t>
+            </w:r>
+          </w:p>
+        </w:tc>
+      </w:tr>
+      <w:tr>
+        <w:tc>
+          <w:tcPr>
+            <w:tcW w:type="dxa" w:w="806"/>
+            <w:tcMar>
+              <w:top w:type="dxa" w:w="80"/>
+              <w:left w:type="dxa" w:w="100"/>
+              <w:bottom w:type="dxa" w:w="80"/>
+              <w:right w:type="dxa" w:w="100"/>
+            </w:tcMar>
+          </w:tcPr>
+          <w:p>
+            <w:r>
+              <w:rPr>
+                <w:b w:val="false"/>
+                <w:bCs w:val="false"/>
+                <w:color w:val="000000"/>
+                <w:sz w:val="20"/>
+                <w:szCs w:val="20"/>
+              </w:rPr>
+              <w:t xml:space="preserve">ASR-04</w:t>
+            </w:r>
+          </w:p>
+        </w:tc>
+        <w:tc>
+          <w:tcPr>
+            <w:tcW w:type="dxa" w:w="1613"/>
+            <w:tcMar>
+              <w:top w:type="dxa" w:w="80"/>
+              <w:left w:type="dxa" w:w="100"/>
+              <w:bottom w:type="dxa" w:w="80"/>
+              <w:right w:type="dxa" w:w="100"/>
+            </w:tcMar>
+          </w:tcPr>
+          <w:p>
+            <w:r>
+              <w:rPr>
+                <w:b w:val="false"/>
+                <w:bCs w:val="false"/>
+                <w:color w:val="000000"/>
+                <w:sz w:val="20"/>
+                <w:szCs w:val="20"/>
+              </w:rPr>
+              <w:t xml:space="preserve">ESC-04 (seguridad del backend)</w:t>
+            </w:r>
+          </w:p>
+        </w:tc>
+        <w:tc>
+          <w:tcPr>
+            <w:tcW w:type="dxa" w:w="1411"/>
+            <w:tcMar>
+              <w:top w:type="dxa" w:w="80"/>
+              <w:left w:type="dxa" w:w="100"/>
+              <w:bottom w:type="dxa" w:w="80"/>
+              <w:right w:type="dxa" w:w="100"/>
+            </w:tcMar>
+          </w:tcPr>
+          <w:p>
+            <w:r>
+              <w:rPr>
+                <w:b w:val="false"/>
+                <w:bCs w:val="false"/>
+                <w:color w:val="000000"/>
+                <w:sz w:val="20"/>
+                <w:szCs w:val="20"/>
+              </w:rPr>
+              <w:t xml:space="preserve">Alta</w:t>
+            </w:r>
+          </w:p>
+        </w:tc>
+        <w:tc>
+          <w:tcPr>
+            <w:tcW w:type="dxa" w:w="2016"/>
+            <w:tcMar>
+              <w:top w:type="dxa" w:w="80"/>
+              <w:left w:type="dxa" w:w="100"/>
+              <w:bottom w:type="dxa" w:w="80"/>
+              <w:right w:type="dxa" w:w="100"/>
+            </w:tcMar>
+          </w:tcPr>
+          <w:p>
+            <w:r>
+              <w:rPr>
+                <w:b w:val="false"/>
+                <w:bCs w:val="false"/>
+                <w:color w:val="000000"/>
+                <w:sz w:val="20"/>
+                <w:szCs w:val="20"/>
+              </w:rPr>
+              <w:t xml:space="preserve">Api/backend_riesgo.py (todos los endpoints)</w:t>
+            </w:r>
+          </w:p>
+        </w:tc>
+        <w:tc>
+          <w:tcPr>
+            <w:tcW w:type="dxa" w:w="2016"/>
+            <w:tcMar>
+              <w:top w:type="dxa" w:w="80"/>
+              <w:left w:type="dxa" w:w="100"/>
+              <w:bottom w:type="dxa" w:w="80"/>
+              <w:right w:type="dxa" w:w="100"/>
+            </w:tcMar>
+          </w:tcPr>
+          <w:p>
+            <w:r>
+              <w:rPr>
+                <w:b w:val="false"/>
+                <w:bCs w:val="false"/>
+                <w:color w:val="000000"/>
+                <w:sz w:val="20"/>
+                <w:szCs w:val="20"/>
+              </w:rPr>
+              <w:t xml:space="preserve">NO satisfecho: no hay autenticación ni control de acceso de ningún tipo hoy.</w:t>
+            </w:r>
+          </w:p>
+        </w:tc>
+        <w:tc>
+          <w:tcPr>
+            <w:tcW w:type="dxa" w:w="2218"/>
+            <w:tcMar>
+              <w:top w:type="dxa" w:w="80"/>
+              <w:left w:type="dxa" w:w="100"/>
+              <w:bottom w:type="dxa" w:w="80"/>
+              <w:right w:type="dxa" w:w="100"/>
+            </w:tcMar>
+          </w:tcPr>
+          <w:p>
+            <w:r>
+              <w:rPr>
+                <w:b w:val="false"/>
+                <w:bCs w:val="false"/>
+                <w:color w:val="000000"/>
+                <w:sz w:val="20"/>
+                <w:szCs w:val="20"/>
+              </w:rPr>
+              <w:t xml:space="preserve">Decisión pendiente del equipo (ver sección 6): agregar un control mínimo, o documentar y aceptar el riesgo explícitamente para este alcance académico.</w:t>
+            </w:r>
+          </w:p>
+        </w:tc>
+      </w:tr>
+    </w:tbl>
     <w:p>
       <w:pPr>
         <w:pStyle w:val="Heading2"/>
@@ -17871,26 +18553,25 @@
     </w:p>
     <w:p>
       <w:pPr>
-        <w:pBdr>
-          <w:left w:val="single" w:color="B45309" w:sz="24"/>
-        </w:pBdr>
-        <w:shd w:fill="FFF4E5" w:val="clear"/>
-        <w:spacing w:after="200" w:before="100"/>
-        <w:ind w:left="180"/>
+        <w:spacing w:after="150"/>
+      </w:pPr>
+      <w:r>
+        <w:t xml:space="preserve">Confirmado por el equipo (2026-10-19): todo el proceso de Design Thinking lo realizó el equipo internamente (David Castelblanco y Johan Fuentes), sin consultar usuarios externos mediante entrevista, observación o inmersión formal. Los "hallazgos" vienen de la experiencia y el criterio propio del equipo como residentes/usuarios potenciales de Bogotá, no de un estudio de campo.</w:t>
+      </w:r>
+    </w:p>
+    <w:p>
+      <w:pPr>
+        <w:spacing w:after="200" w:before="60"/>
       </w:pPr>
       <w:r>
         <w:rPr>
-          <w:b/>
-          <w:bCs/>
-          <w:color w:val="B45309"/>
+          <w:i/>
+          <w:iCs/>
+          <w:color w:val="555555"/>
+          <w:sz w:val="20"/>
+          <w:szCs w:val="20"/>
         </w:rPr>
-        <w:t xml:space="preserve">PENDIENTE — </w:t>
-      </w:r>
-      <w:r>
-        <w:rPr>
-          <w:color w:val="5A3E1B"/>
-        </w:rPr>
-        <w:t xml:space="preserve">¿Se consultó a usuarios reales (entrevista, observación, inmersión) o el diseño partió de supuestos del propio equipo? Esto determina si esta sección se llena con hallazgos reales o se documenta honestamente como diseño por intuición propia — ambas son válidas, pero no se pueden mezclar.</w:t>
+        <w:t xml:space="preserve">Documentado así deliberadamente en vez de inventar entrevistas que no ocurrieron: un evaluador puede preguntar por los participantes de la investigación en la sustentación, y la respuesta honesta es que no hubo usuarios externos consultados en esta fase.</w:t>
       </w:r>
     </w:p>
     <w:p>
@@ -17918,26 +18599,10 @@
     </w:p>
     <w:p>
       <w:pPr>
-        <w:pBdr>
-          <w:left w:val="single" w:color="B45309" w:sz="24"/>
-        </w:pBdr>
-        <w:shd w:fill="FFF4E5" w:val="clear"/>
-        <w:spacing w:after="200" w:before="100"/>
-        <w:ind w:left="180"/>
-      </w:pPr>
-      <w:r>
-        <w:rPr>
-          <w:b/>
-          <w:bCs/>
-          <w:color w:val="B45309"/>
-        </w:rPr>
-        <w:t xml:space="preserve">PENDIENTE — </w:t>
-      </w:r>
-      <w:r>
-        <w:rPr>
-          <w:color w:val="5A3E1B"/>
-        </w:rPr>
-        <w:t xml:space="preserve">Perfil representativo (persona) y la pregunta '¿Cómo podríamos...?' que guió el diseño — depende de 1.1.</w:t>
+        <w:spacing w:after="150"/>
+      </w:pPr>
+      <w:r>
+        <w:t xml:space="preserve">Sin perfil (persona) formal derivado de investigación de usuarios, por lo mismo que 1.1. El punto de vista de diseño fue informal: "alguien que se mueve por Bogotá y quiere saber si una zona es riesgosa antes de llegar", formulado por el propio equipo.</w:t>
       </w:r>
     </w:p>
     <w:p>
@@ -17965,26 +18630,10 @@
     </w:p>
     <w:p>
       <w:pPr>
-        <w:pBdr>
-          <w:left w:val="single" w:color="B45309" w:sz="24"/>
-        </w:pBdr>
-        <w:shd w:fill="FFF4E5" w:val="clear"/>
-        <w:spacing w:after="200" w:before="100"/>
-        <w:ind w:left="180"/>
-      </w:pPr>
-      <w:r>
-        <w:rPr>
-          <w:b/>
-          <w:bCs/>
-          <w:color w:val="B45309"/>
-        </w:rPr>
-        <w:t xml:space="preserve">PENDIENTE — </w:t>
-      </w:r>
-      <w:r>
-        <w:rPr>
-          <w:color w:val="5A3E1B"/>
-        </w:rPr>
-        <w:t xml:space="preserve">Alternativas que se consideraron antes de llegar al diseño actual (ej. ¿se pensó en otra forma de mostrar el riesgo antes del mapa de calor?) y por qué se descartaron.</w:t>
+        <w:spacing w:after="150"/>
+      </w:pPr>
+      <w:r>
+        <w:t xml:space="preserve">No se documentó un proceso formal de generación y comparación de alternativas con criterios explícitos. Las alternativas de diseño que sí quedaron registradas (ej. Canvas propio vs. Google Maps embebido, TF-IDF vs. embeddings para el RAG, reglas vs. Machine Learning para el riesgo) están documentadas como decisiones arquitectónicas en la sección 3.4 (ADRs), tomadas sobre la marcha durante el desarrollo, no en una sesión de ideación previa separada.</w:t>
       </w:r>
     </w:p>
     <w:p>
@@ -18012,26 +18661,10 @@
     </w:p>
     <w:p>
       <w:pPr>
-        <w:pBdr>
-          <w:left w:val="single" w:color="B45309" w:sz="24"/>
-        </w:pBdr>
-        <w:shd w:fill="FFF4E5" w:val="clear"/>
-        <w:spacing w:after="200" w:before="100"/>
-        <w:ind w:left="180"/>
-      </w:pPr>
-      <w:r>
-        <w:rPr>
-          <w:b/>
-          <w:bCs/>
-          <w:color w:val="B45309"/>
-        </w:rPr>
-        <w:t xml:space="preserve">PENDIENTE — </w:t>
-      </w:r>
-      <w:r>
-        <w:rPr>
-          <w:color w:val="5A3E1B"/>
-        </w:rPr>
-        <w:t xml:space="preserve">¿Hubo un prototipo de baja/media fidelidad antes de construir la app real, o se construyó directo? Si hay capturas o bocetos tempranos, agregarlos aquí.</w:t>
+        <w:spacing w:after="150"/>
+      </w:pPr>
+      <w:r>
+        <w:t xml:space="preserve">No hubo un prototipo de baja/media fidelidad previo (mockups, wireframes) -- el equipo construyó directamente la app funcional iterando sobre ella misma. El "prototipo" de facto fueron las primeras versiones funcionales de la app (ver historial de versiones en apk/), probadas por el propio equipo.</w:t>
       </w:r>
     </w:p>
     <w:p>
@@ -18059,26 +18692,10 @@
     </w:p>
     <w:p>
       <w:pPr>
-        <w:pBdr>
-          <w:left w:val="single" w:color="B45309" w:sz="24"/>
-        </w:pBdr>
-        <w:shd w:fill="FFF4E5" w:val="clear"/>
-        <w:spacing w:after="200" w:before="100"/>
-        <w:ind w:left="180"/>
-      </w:pPr>
-      <w:r>
-        <w:rPr>
-          <w:b/>
-          <w:bCs/>
-          <w:color w:val="B45309"/>
-        </w:rPr>
-        <w:t xml:space="preserve">PENDIENTE — </w:t>
-      </w:r>
-      <w:r>
-        <w:rPr>
-          <w:color w:val="5A3E1B"/>
-        </w:rPr>
-        <w:t xml:space="preserve">Sesiones de prueba con usuarios y cambios que originaron en el prototipo o los requisitos — si no se hicieron, documentarlo así.</w:t>
+        <w:spacing w:after="150"/>
+      </w:pPr>
+      <w:r>
+        <w:t xml:space="preserve">No hubo sesiones de prueba con usuarios externos. La evaluación fue interna: el equipo probó la app, identificó fallas (ej. lentitud del mapa, bugs de chat documentados en los commits "fix:" del historial de git) y corrigió directamente en el código, en vez de a través de un ciclo formal prototipo-retroalimentación-rediseño con terceros.</w:t>
       </w:r>
     </w:p>
     <w:p>
@@ -18109,31 +18726,22 @@
         <w:spacing w:after="150"/>
       </w:pPr>
       <w:r>
-        <w:t xml:space="preserve">Evidencia observable en el repositorio: desarrollo incremental mediante commits directos sobre main, sin tablero (Trello/GitHub Projects/Jira) encontrado en el repositorio ni referenciado en el código.</w:t>
-      </w:r>
-    </w:p>
-    <w:p>
-      <w:pPr>
-        <w:pBdr>
-          <w:left w:val="single" w:color="B45309" w:sz="24"/>
-        </w:pBdr>
-        <w:shd w:fill="FFF4E5" w:val="clear"/>
-        <w:spacing w:after="200" w:before="100"/>
-        <w:ind w:left="180"/>
+        <w:t xml:space="preserve">Confirmado por el equipo: no se usó Scrum, Kanban ni ningún tablero (Trello/GitHub Projects/Jira/papel). El flujo real fue desarrollo incremental informal: commits directos sobre main, con mensajes descriptivos del cambio (varios con prefijo "feat:"/"fix:" en el historial reciente), sin sprints, backlog formal ni ceremonias.</w:t>
+      </w:r>
+    </w:p>
+    <w:p>
+      <w:pPr>
+        <w:spacing w:after="200" w:before="60"/>
       </w:pPr>
       <w:r>
         <w:rPr>
-          <w:b/>
-          <w:bCs/>
-          <w:color w:val="B45309"/>
+          <w:i/>
+          <w:iCs/>
+          <w:color w:val="555555"/>
+          <w:sz w:val="20"/>
+          <w:szCs w:val="20"/>
         </w:rPr>
-        <w:t xml:space="preserve">PENDIENTE — </w:t>
-      </w:r>
-      <w:r>
-        <w:rPr>
-          <w:color w:val="5A3E1B"/>
-        </w:rPr>
-        <w:t xml:space="preserve">¿Usaron algún tablero fuera del repositorio (Trello, Notion, papel)? Si la respuesta es no, lo más honesto es documentar el flujo real observado (commits incrementales, sin ceremonias formales) en vez de describir un Scrum/Kanban que no se siguió — un evaluador puede preguntar por el tablero en la sustentación.</w:t>
+        <w:t xml:space="preserve">Esto es una limitación metodológica real frente al estándar pedido (que asume Scrum o Kanban), no solo una omisión de documentación. Si el asesor exige evidencia de un marco formal, la opción honesta es reconocerlo como área de mejora identificada en retrospectiva, no simular un tablero que no existió.</w:t>
       </w:r>
     </w:p>
     <w:p>
@@ -18161,26 +18769,483 @@
     </w:p>
     <w:p>
       <w:pPr>
-        <w:pBdr>
-          <w:left w:val="single" w:color="B45309" w:sz="24"/>
-        </w:pBdr>
-        <w:shd w:fill="FFF4E5" w:val="clear"/>
-        <w:spacing w:after="200" w:before="100"/>
-        <w:ind w:left="180"/>
+        <w:spacing w:after="150"/>
+      </w:pPr>
+      <w:r>
+        <w:t xml:space="preserve">Investigación de soluciones existentes (2026-10-19), ya que el equipo no había encontrado comparables previamente:</w:t>
+      </w:r>
+    </w:p>
+    <w:tbl>
+      <w:tblPr>
+        <w:tblW w:type="dxa" w:w="10080"/>
+        <w:tblBorders>
+          <w:top w:val="single" w:color="auto" w:sz="4"/>
+          <w:left w:val="single" w:color="auto" w:sz="4"/>
+          <w:bottom w:val="single" w:color="auto" w:sz="4"/>
+          <w:right w:val="single" w:color="auto" w:sz="4"/>
+          <w:insideH w:val="single" w:color="auto" w:sz="4"/>
+          <w:insideV w:val="single" w:color="auto" w:sz="4"/>
+        </w:tblBorders>
+      </w:tblPr>
+      <w:tblGrid>
+        <w:gridCol w:w="2218"/>
+        <w:gridCol w:w="4032"/>
+        <w:gridCol w:w="3830"/>
+      </w:tblGrid>
+      <w:tr>
+        <w:trPr>
+          <w:tblHeader/>
+        </w:trPr>
+        <w:tc>
+          <w:tcPr>
+            <w:tcW w:type="dxa" w:w="2218"/>
+            <w:shd w:fill="1F3864" w:val="clear"/>
+            <w:tcMar>
+              <w:top w:type="dxa" w:w="80"/>
+              <w:left w:type="dxa" w:w="100"/>
+              <w:bottom w:type="dxa" w:w="80"/>
+              <w:right w:type="dxa" w:w="100"/>
+            </w:tcMar>
+          </w:tcPr>
+          <w:p>
+            <w:r>
+              <w:rPr>
+                <w:b/>
+                <w:bCs/>
+                <w:color w:val="FFFFFF"/>
+                <w:sz w:val="20"/>
+                <w:szCs w:val="20"/>
+              </w:rPr>
+              <w:t xml:space="preserve">Solución existente</w:t>
+            </w:r>
+          </w:p>
+        </w:tc>
+        <w:tc>
+          <w:tcPr>
+            <w:tcW w:type="dxa" w:w="4032"/>
+            <w:shd w:fill="1F3864" w:val="clear"/>
+            <w:tcMar>
+              <w:top w:type="dxa" w:w="80"/>
+              <w:left w:type="dxa" w:w="100"/>
+              <w:bottom w:type="dxa" w:w="80"/>
+              <w:right w:type="dxa" w:w="100"/>
+            </w:tcMar>
+          </w:tcPr>
+          <w:p>
+            <w:r>
+              <w:rPr>
+                <w:b/>
+                <w:bCs/>
+                <w:color w:val="FFFFFF"/>
+                <w:sz w:val="20"/>
+                <w:szCs w:val="20"/>
+              </w:rPr>
+              <w:t xml:space="preserve">Qué hace</w:t>
+            </w:r>
+          </w:p>
+        </w:tc>
+        <w:tc>
+          <w:tcPr>
+            <w:tcW w:type="dxa" w:w="3830"/>
+            <w:shd w:fill="1F3864" w:val="clear"/>
+            <w:tcMar>
+              <w:top w:type="dxa" w:w="80"/>
+              <w:left w:type="dxa" w:w="100"/>
+              <w:bottom w:type="dxa" w:w="80"/>
+              <w:right w:type="dxa" w:w="100"/>
+            </w:tcMar>
+          </w:tcPr>
+          <w:p>
+            <w:r>
+              <w:rPr>
+                <w:b/>
+                <w:bCs/>
+                <w:color w:val="FFFFFF"/>
+                <w:sz w:val="20"/>
+                <w:szCs w:val="20"/>
+              </w:rPr>
+              <w:t xml:space="preserve">Diferencia con Barrio Seguro</w:t>
+            </w:r>
+          </w:p>
+        </w:tc>
+      </w:tr>
+      <w:tr>
+        <w:tc>
+          <w:tcPr>
+            <w:tcW w:type="dxa" w:w="2218"/>
+            <w:tcMar>
+              <w:top w:type="dxa" w:w="80"/>
+              <w:left w:type="dxa" w:w="100"/>
+              <w:bottom w:type="dxa" w:w="80"/>
+              <w:right w:type="dxa" w:w="100"/>
+            </w:tcMar>
+          </w:tcPr>
+          <w:p>
+            <w:r>
+              <w:rPr>
+                <w:b w:val="false"/>
+                <w:bCs w:val="false"/>
+                <w:color w:val="000000"/>
+                <w:sz w:val="20"/>
+                <w:szCs w:val="20"/>
+              </w:rPr>
+              <w:t xml:space="preserve">Compromiso Secretaría de Seguridad de Bogotá (Open Government Partnership)</w:t>
+            </w:r>
+          </w:p>
+        </w:tc>
+        <w:tc>
+          <w:tcPr>
+            <w:tcW w:type="dxa" w:w="4032"/>
+            <w:tcMar>
+              <w:top w:type="dxa" w:w="80"/>
+              <w:left w:type="dxa" w:w="100"/>
+              <w:bottom w:type="dxa" w:w="80"/>
+              <w:right w:type="dxa" w:w="100"/>
+            </w:tcMar>
+          </w:tcPr>
+          <w:p>
+            <w:r>
+              <w:rPr>
+                <w:b w:val="false"/>
+                <w:bCs w:val="false"/>
+                <w:color w:val="000000"/>
+                <w:sz w:val="20"/>
+                <w:szCs w:val="20"/>
+              </w:rPr>
+              <w:t xml:space="preserve">Propuesta gubernamental de una app para que la ciudadanía reporte incidentes y reciba información de seguridad. Según la evidencia pública revisada, no se confirma que ya esté en operación.</w:t>
+            </w:r>
+          </w:p>
+        </w:tc>
+        <w:tc>
+          <w:tcPr>
+            <w:tcW w:type="dxa" w:w="3830"/>
+            <w:tcMar>
+              <w:top w:type="dxa" w:w="80"/>
+              <w:left w:type="dxa" w:w="100"/>
+              <w:bottom w:type="dxa" w:w="80"/>
+              <w:right w:type="dxa" w:w="100"/>
+            </w:tcMar>
+          </w:tcPr>
+          <w:p>
+            <w:r>
+              <w:rPr>
+                <w:b w:val="false"/>
+                <w:bCs w:val="false"/>
+                <w:color w:val="000000"/>
+                <w:sz w:val="20"/>
+                <w:szCs w:val="20"/>
+              </w:rPr>
+              <w:t xml:space="preserve">Barrio Seguro ya está implementado y funcionando; no depende de reportes ciudadanos en tiempo real sino de datos oficiales de delito ya verificados, combinados con un agente conversacional.</w:t>
+            </w:r>
+          </w:p>
+        </w:tc>
+      </w:tr>
+      <w:tr>
+        <w:tc>
+          <w:tcPr>
+            <w:tcW w:type="dxa" w:w="2218"/>
+            <w:tcMar>
+              <w:top w:type="dxa" w:w="80"/>
+              <w:left w:type="dxa" w:w="100"/>
+              <w:bottom w:type="dxa" w:w="80"/>
+              <w:right w:type="dxa" w:w="100"/>
+            </w:tcMar>
+          </w:tcPr>
+          <w:p>
+            <w:r>
+              <w:rPr>
+                <w:b w:val="false"/>
+                <w:bCs w:val="false"/>
+                <w:color w:val="000000"/>
+                <w:sz w:val="20"/>
+                <w:szCs w:val="20"/>
+              </w:rPr>
+              <w:t xml:space="preserve">SafeMap (tesis Universidad EAN, para Engativá)</w:t>
+            </w:r>
+          </w:p>
+        </w:tc>
+        <w:tc>
+          <w:tcPr>
+            <w:tcW w:type="dxa" w:w="4032"/>
+            <w:tcMar>
+              <w:top w:type="dxa" w:w="80"/>
+              <w:left w:type="dxa" w:w="100"/>
+              <w:bottom w:type="dxa" w:w="80"/>
+              <w:right w:type="dxa" w:w="100"/>
+            </w:tcMar>
+          </w:tcPr>
+          <w:p>
+            <w:r>
+              <w:rPr>
+                <w:b w:val="false"/>
+                <w:bCs w:val="false"/>
+                <w:color w:val="000000"/>
+                <w:sz w:val="20"/>
+                <w:szCs w:val="20"/>
+              </w:rPr>
+              <w:t xml:space="preserve">Plataforma web colaborativa para reportar y analizar espacialmente factores de riesgo urbano (iluminación deficiente, lotes baldíos, basura), buscando cerrar la brecha entre cifras oficiales y percepción de inseguridad.</w:t>
+            </w:r>
+          </w:p>
+        </w:tc>
+        <w:tc>
+          <w:tcPr>
+            <w:tcW w:type="dxa" w:w="3830"/>
+            <w:tcMar>
+              <w:top w:type="dxa" w:w="80"/>
+              <w:left w:type="dxa" w:w="100"/>
+              <w:bottom w:type="dxa" w:w="80"/>
+              <w:right w:type="dxa" w:w="100"/>
+            </w:tcMar>
+          </w:tcPr>
+          <w:p>
+            <w:r>
+              <w:rPr>
+                <w:b w:val="false"/>
+                <w:bCs w:val="false"/>
+                <w:color w:val="000000"/>
+                <w:sz w:val="20"/>
+                <w:szCs w:val="20"/>
+              </w:rPr>
+              <w:t xml:space="preserve">Barrio Seguro cubre las 20 localidades de Bogotá (no solo una), combina delito verificado + contexto urbano + un agente de IA conversacional, y corre como app móvil nativa con alertas de geolocalización en segundo plano, no solo una plataforma web de reportes.</w:t>
+            </w:r>
+          </w:p>
+        </w:tc>
+      </w:tr>
+      <w:tr>
+        <w:tc>
+          <w:tcPr>
+            <w:tcW w:type="dxa" w:w="2218"/>
+            <w:tcMar>
+              <w:top w:type="dxa" w:w="80"/>
+              <w:left w:type="dxa" w:w="100"/>
+              <w:bottom w:type="dxa" w:w="80"/>
+              <w:right w:type="dxa" w:w="100"/>
+            </w:tcMar>
+          </w:tcPr>
+          <w:p>
+            <w:r>
+              <w:rPr>
+                <w:b w:val="false"/>
+                <w:bCs w:val="false"/>
+                <w:color w:val="000000"/>
+                <w:sz w:val="20"/>
+                <w:szCs w:val="20"/>
+              </w:rPr>
+              <w:t xml:space="preserve">BICI-SAFE (Universidad Distrital)</w:t>
+            </w:r>
+          </w:p>
+        </w:tc>
+        <w:tc>
+          <w:tcPr>
+            <w:tcW w:type="dxa" w:w="4032"/>
+            <w:tcMar>
+              <w:top w:type="dxa" w:w="80"/>
+              <w:left w:type="dxa" w:w="100"/>
+              <w:bottom w:type="dxa" w:w="80"/>
+              <w:right w:type="dxa" w:w="100"/>
+            </w:tcMar>
+          </w:tcPr>
+          <w:p>
+            <w:r>
+              <w:rPr>
+                <w:b w:val="false"/>
+                <w:bCs w:val="false"/>
+                <w:color w:val="000000"/>
+                <w:sz w:val="20"/>
+                <w:szCs w:val="20"/>
+              </w:rPr>
+              <w:t xml:space="preserve">App web para reportar hurtos y daños en ciclorutas de Bogotá; genera mapa de calor de zonas con más hurtos reportados.</w:t>
+            </w:r>
+          </w:p>
+        </w:tc>
+        <w:tc>
+          <w:tcPr>
+            <w:tcW w:type="dxa" w:w="3830"/>
+            <w:tcMar>
+              <w:top w:type="dxa" w:w="80"/>
+              <w:left w:type="dxa" w:w="100"/>
+              <w:bottom w:type="dxa" w:w="80"/>
+              <w:right w:type="dxa" w:w="100"/>
+            </w:tcMar>
+          </w:tcPr>
+          <w:p>
+            <w:r>
+              <w:rPr>
+                <w:b w:val="false"/>
+                <w:bCs w:val="false"/>
+                <w:color w:val="000000"/>
+                <w:sz w:val="20"/>
+                <w:szCs w:val="20"/>
+              </w:rPr>
+              <w:t xml:space="preserve">Alcance distinto (ciclorutas específicamente, no seguridad general por localidad) y basado en reportes de usuarios, no en delito verificado oficial ni en un agente de IA.</w:t>
+            </w:r>
+          </w:p>
+        </w:tc>
+      </w:tr>
+      <w:tr>
+        <w:tc>
+          <w:tcPr>
+            <w:tcW w:type="dxa" w:w="2218"/>
+            <w:tcMar>
+              <w:top w:type="dxa" w:w="80"/>
+              <w:left w:type="dxa" w:w="100"/>
+              <w:bottom w:type="dxa" w:w="80"/>
+              <w:right w:type="dxa" w:w="100"/>
+            </w:tcMar>
+          </w:tcPr>
+          <w:p>
+            <w:r>
+              <w:rPr>
+                <w:b w:val="false"/>
+                <w:bCs w:val="false"/>
+                <w:color w:val="000000"/>
+                <w:sz w:val="20"/>
+                <w:szCs w:val="20"/>
+              </w:rPr>
+              <w:t xml:space="preserve">SpotCrime (internacional, EE.UU./Reino Unido/Canadá)</w:t>
+            </w:r>
+          </w:p>
+        </w:tc>
+        <w:tc>
+          <w:tcPr>
+            <w:tcW w:type="dxa" w:w="4032"/>
+            <w:tcMar>
+              <w:top w:type="dxa" w:w="80"/>
+              <w:left w:type="dxa" w:w="100"/>
+              <w:bottom w:type="dxa" w:w="80"/>
+              <w:right w:type="dxa" w:w="100"/>
+            </w:tcMar>
+          </w:tcPr>
+          <w:p>
+            <w:r>
+              <w:rPr>
+                <w:b w:val="false"/>
+                <w:bCs w:val="false"/>
+                <w:color w:val="000000"/>
+                <w:sz w:val="20"/>
+                <w:szCs w:val="20"/>
+              </w:rPr>
+              <w:t xml:space="preserve">Mapa de delitos con datos agregados de policías/noticias, alertas principalmente por correo para direcciones o zonas específicas.</w:t>
+            </w:r>
+          </w:p>
+        </w:tc>
+        <w:tc>
+          <w:tcPr>
+            <w:tcW w:type="dxa" w:w="3830"/>
+            <w:tcMar>
+              <w:top w:type="dxa" w:w="80"/>
+              <w:left w:type="dxa" w:w="100"/>
+              <w:bottom w:type="dxa" w:w="80"/>
+              <w:right w:type="dxa" w:w="100"/>
+            </w:tcMar>
+          </w:tcPr>
+          <w:p>
+            <w:r>
+              <w:rPr>
+                <w:b w:val="false"/>
+                <w:bCs w:val="false"/>
+                <w:color w:val="000000"/>
+                <w:sz w:val="20"/>
+                <w:szCs w:val="20"/>
+              </w:rPr>
+              <w:t xml:space="preserve">Barrio Seguro usa alertas push nativas por geolocalización en tiempo real (no solo correo), y un agente conversacional que responde preguntas en lenguaje natural en vez de solo mostrar un mapa.</w:t>
+            </w:r>
+          </w:p>
+        </w:tc>
+      </w:tr>
+      <w:tr>
+        <w:tc>
+          <w:tcPr>
+            <w:tcW w:type="dxa" w:w="2218"/>
+            <w:tcMar>
+              <w:top w:type="dxa" w:w="80"/>
+              <w:left w:type="dxa" w:w="100"/>
+              <w:bottom w:type="dxa" w:w="80"/>
+              <w:right w:type="dxa" w:w="100"/>
+            </w:tcMar>
+          </w:tcPr>
+          <w:p>
+            <w:r>
+              <w:rPr>
+                <w:b w:val="false"/>
+                <w:bCs w:val="false"/>
+                <w:color w:val="000000"/>
+                <w:sz w:val="20"/>
+                <w:szCs w:val="20"/>
+              </w:rPr>
+              <w:t xml:space="preserve">Citizen (internacional, EE.UU.)</w:t>
+            </w:r>
+          </w:p>
+        </w:tc>
+        <w:tc>
+          <w:tcPr>
+            <w:tcW w:type="dxa" w:w="4032"/>
+            <w:tcMar>
+              <w:top w:type="dxa" w:w="80"/>
+              <w:left w:type="dxa" w:w="100"/>
+              <w:bottom w:type="dxa" w:w="80"/>
+              <w:right w:type="dxa" w:w="100"/>
+            </w:tcMar>
+          </w:tcPr>
+          <w:p>
+            <w:r>
+              <w:rPr>
+                <w:b w:val="false"/>
+                <w:bCs w:val="false"/>
+                <w:color w:val="000000"/>
+                <w:sz w:val="20"/>
+                <w:szCs w:val="20"/>
+              </w:rPr>
+              <w:t xml:space="preserve">Alertas push en vivo de incidentes/emergencias, con monitoreo de comunicaciones de despacho 911 y reportes de usuarios; cobertura amplia (crimen, accidentes, emergencias).</w:t>
+            </w:r>
+          </w:p>
+        </w:tc>
+        <w:tc>
+          <w:tcPr>
+            <w:tcW w:type="dxa" w:w="3830"/>
+            <w:tcMar>
+              <w:top w:type="dxa" w:w="80"/>
+              <w:left w:type="dxa" w:w="100"/>
+              <w:bottom w:type="dxa" w:w="80"/>
+              <w:right w:type="dxa" w:w="100"/>
+            </w:tcMar>
+          </w:tcPr>
+          <w:p>
+            <w:r>
+              <w:rPr>
+                <w:b w:val="false"/>
+                <w:bCs w:val="false"/>
+                <w:color w:val="000000"/>
+                <w:sz w:val="20"/>
+                <w:szCs w:val="20"/>
+              </w:rPr>
+              <w:t xml:space="preserve">Citizen depende de una operación de monitoreo humano 24/7 sobre comunicaciones de emergencia -- modelo costoso de operar y replicar. Barrio Seguro deriva su clasificación de datos abiertos ya publicados (sin esa infraestructura de monitoreo), con reglas y geofencing explicables, más un agente de IA especializado en el dominio.</w:t>
+            </w:r>
+          </w:p>
+        </w:tc>
+      </w:tr>
+    </w:tbl>
+    <w:p>
+      <w:pPr>
+        <w:spacing w:after="150"/>
+      </w:pPr>
+      <w:r>
+        <w:t xml:space="preserve">Tipo de innovación (Manual de Oslo 2018): innovación de producto, nueva para el contexto local (no se encontró una app equivalente en operación en Bogotá que combine delito verificado georreferenciado por localidad + agente conversacional con tool-calling + alertas proactivas por geolocalización). No se identificó evidencia de que sea nueva para el mercado internacional, dado que SpotCrime y Citizen cubren necesidades similares en otros países desde hace años.</w:t>
+      </w:r>
+    </w:p>
+    <w:p>
+      <w:pPr>
+        <w:spacing w:after="200" w:before="60"/>
       </w:pPr>
       <w:r>
         <w:rPr>
-          <w:b/>
-          <w:bCs/>
-          <w:color w:val="B45309"/>
+          <w:i/>
+          <w:iCs/>
+          <w:color w:val="555555"/>
+          <w:sz w:val="20"/>
+          <w:szCs w:val="20"/>
         </w:rPr>
-        <w:t xml:space="preserve">PENDIENTE — </w:t>
-      </w:r>
-      <w:r>
-        <w:rPr>
-          <w:color w:val="5A3E1B"/>
-        </w:rPr>
-        <w:t xml:space="preserve">Con qué soluciones existentes se compara el proyecto (ej. línea 123/NUSE oficial, apps de seguridad ciudadana existentes en Colombia) y qué aporta de diferente Barrio Seguro frente a ellas, según el Manual de Oslo 2018. Requiere investigación de mercado que el equipo debe hacer.</w:t>
+        <w:t xml:space="preserve">Fuentes consultadas: opengovpartnership.org (evidencia de compromiso Secretaría de Seguridad), repository.universidadean.edu.co (tesis SafeMap), repository.udistrital.edu.co (BICI-SAFE), y páginas oficiales/de prensa de SpotCrime y Citizen. Búsqueda realizada 2026-10-19; se recomienda verificar vigencia antes de la entrega final, especialmente el estado del compromiso gubernamental (podría pasar de propuesta a app real).</w:t>
       </w:r>
     </w:p>
     <w:p>

</xml_diff>